<commit_message>
Added the logic to Update the User Details
</commit_message>
<xml_diff>
--- a/CRM App/PRD.docx
+++ b/CRM App/PRD.docx
@@ -143,10 +143,7 @@
         </w:numPr>
       </w:pPr>
       <w:r>
-        <w:t>Customer should be able t</w:t>
-      </w:r>
-      <w:r>
-        <w:t>o raise an issue.</w:t>
+        <w:t>Customer should be able to raise an issue.</w:t>
       </w:r>
     </w:p>
     <w:p>
@@ -158,10 +155,7 @@
         </w:numPr>
       </w:pPr>
       <w:r>
-        <w:t>Customer should be able to</w:t>
-      </w:r>
-      <w:r>
-        <w:t xml:space="preserve"> check the latest status of the issue raised.</w:t>
+        <w:t>Customer should be able to check the latest status of the issue raised.</w:t>
       </w:r>
     </w:p>
     <w:p>
@@ -173,10 +167,7 @@
         </w:numPr>
       </w:pPr>
       <w:r>
-        <w:t>Customer should be able to</w:t>
-      </w:r>
-      <w:r>
-        <w:t xml:space="preserve"> modify the issue raised.</w:t>
+        <w:t>Customer should be able to modify the issue raised.</w:t>
       </w:r>
     </w:p>
     <w:p>
@@ -188,10 +179,7 @@
         </w:numPr>
       </w:pPr>
       <w:r>
-        <w:t>Customer should be able to</w:t>
-      </w:r>
-      <w:r>
-        <w:t xml:space="preserve"> check the complete history of the issue raised.</w:t>
+        <w:t>Customer should be able to check the complete history of the issue raised.</w:t>
       </w:r>
     </w:p>
     <w:p>
@@ -203,10 +191,7 @@
         </w:numPr>
       </w:pPr>
       <w:r>
-        <w:t>Customer should be able to</w:t>
-      </w:r>
-      <w:r>
-        <w:t xml:space="preserve"> close the ticket himself.</w:t>
+        <w:t>Customer should be able to close the ticket himself.</w:t>
       </w:r>
     </w:p>
     <w:p>
@@ -218,18 +203,7 @@
         </w:numPr>
       </w:pPr>
       <w:r>
-        <w:t>Customer should</w:t>
-      </w:r>
-      <w:r>
-        <w:t xml:space="preserve"> </w:t>
-      </w:r>
-      <w:proofErr w:type="gramStart"/>
-      <w:r>
-        <w:t>not</w:t>
-      </w:r>
-      <w:proofErr w:type="gramEnd"/>
-      <w:r>
-        <w:t xml:space="preserve"> able to see the tickets of other customers.</w:t>
+        <w:t>Customer should not able to see the tickets of other customers.</w:t>
       </w:r>
     </w:p>
     <w:p>
@@ -311,10 +285,7 @@
         </w:numPr>
       </w:pPr>
       <w:r>
-        <w:t>Should be able to</w:t>
-      </w:r>
-      <w:r>
-        <w:t xml:space="preserve"> close the issue.</w:t>
+        <w:t>Should be able to close the issue.</w:t>
       </w:r>
     </w:p>
     <w:p>
@@ -326,10 +297,7 @@
         </w:numPr>
       </w:pPr>
       <w:r>
-        <w:t>Should be able to</w:t>
-      </w:r>
-      <w:r>
-        <w:t xml:space="preserve"> see the complete list of issues assigned to him.</w:t>
+        <w:t>Should be able to see the complete list of issues assigned to him.</w:t>
       </w:r>
     </w:p>
     <w:p>
@@ -341,10 +309,7 @@
         </w:numPr>
       </w:pPr>
       <w:r>
-        <w:t>Should be able to</w:t>
-      </w:r>
-      <w:r>
-        <w:t xml:space="preserve"> search for an issue</w:t>
+        <w:t>Should be able to search for an issue</w:t>
       </w:r>
     </w:p>
     <w:p>
@@ -356,10 +321,7 @@
         </w:numPr>
       </w:pPr>
       <w:r>
-        <w:t>Should be able to</w:t>
-      </w:r>
-      <w:r>
-        <w:t xml:space="preserve"> filter the issues assigned to him based on the ticket status.</w:t>
+        <w:t>Should be able to filter the issues assigned to him based on the ticket status.</w:t>
       </w:r>
     </w:p>
     <w:p>
@@ -434,10 +396,7 @@
         </w:numPr>
       </w:pPr>
       <w:r>
-        <w:t>Should be able to</w:t>
-      </w:r>
-      <w:r>
-        <w:t xml:space="preserve"> see all the active tickets.</w:t>
+        <w:t>Should be able to see all the active tickets.</w:t>
       </w:r>
     </w:p>
     <w:p>
@@ -898,7 +857,6 @@
         </w:rPr>
         <w:t xml:space="preserve"> login. Login API call should return the access token which will be used to make the other calls. Login API will succeed only if </w:t>
       </w:r>
-      <w:proofErr w:type="gramStart"/>
       <w:r>
         <w:rPr>
           <w:sz w:val="28"/>
@@ -913,9 +871,8 @@
           <w:sz w:val="28"/>
           <w:szCs w:val="28"/>
         </w:rPr>
-        <w:t xml:space="preserve"> ENGINEER</w:t>
-      </w:r>
-      <w:proofErr w:type="gramEnd"/>
+        <w:t>ENGINEER</w:t>
+      </w:r>
       <w:r>
         <w:rPr>
           <w:b/>
@@ -963,6 +920,264 @@
           <w:szCs w:val="28"/>
         </w:rPr>
         <w:t>has not yet approved/rejected the registration request should be displayed.</w:t>
+      </w:r>
+    </w:p>
+    <w:p>
+      <w:pPr>
+        <w:pStyle w:val="ListParagraph"/>
+        <w:numPr>
+          <w:ilvl w:val="0"/>
+          <w:numId w:val="6"/>
+        </w:numPr>
+        <w:tabs>
+          <w:tab w:val="left" w:pos="990"/>
+        </w:tabs>
+        <w:rPr>
+          <w:b/>
+          <w:bCs/>
+          <w:sz w:val="32"/>
+          <w:szCs w:val="32"/>
+        </w:rPr>
+      </w:pPr>
+      <w:r>
+        <w:rPr>
+          <w:b/>
+          <w:bCs/>
+          <w:sz w:val="32"/>
+          <w:szCs w:val="32"/>
+        </w:rPr>
+        <w:t>Feature 1: User Authentication authorization APIs</w:t>
+      </w:r>
+    </w:p>
+    <w:p>
+      <w:pPr>
+        <w:tabs>
+          <w:tab w:val="left" w:pos="990"/>
+        </w:tabs>
+        <w:ind w:left="360"/>
+        <w:rPr>
+          <w:b/>
+          <w:bCs/>
+          <w:sz w:val="32"/>
+          <w:szCs w:val="32"/>
+        </w:rPr>
+      </w:pPr>
+      <w:r>
+        <w:rPr>
+          <w:b/>
+          <w:bCs/>
+          <w:sz w:val="32"/>
+          <w:szCs w:val="32"/>
+        </w:rPr>
+        <w:lastRenderedPageBreak/>
+        <w:t xml:space="preserve">Feature </w:t>
+      </w:r>
+      <w:r>
+        <w:rPr>
+          <w:b/>
+          <w:bCs/>
+          <w:sz w:val="32"/>
+          <w:szCs w:val="32"/>
+        </w:rPr>
+        <w:t>2</w:t>
+      </w:r>
+      <w:r>
+        <w:rPr>
+          <w:b/>
+          <w:bCs/>
+          <w:sz w:val="32"/>
+          <w:szCs w:val="32"/>
+        </w:rPr>
+        <w:t xml:space="preserve">: </w:t>
+      </w:r>
+      <w:r>
+        <w:rPr>
+          <w:b/>
+          <w:bCs/>
+          <w:sz w:val="32"/>
+          <w:szCs w:val="32"/>
+        </w:rPr>
+        <w:t>Authenticating and Authorizing the user APIs</w:t>
+      </w:r>
+    </w:p>
+    <w:p>
+      <w:pPr>
+        <w:tabs>
+          <w:tab w:val="left" w:pos="990"/>
+        </w:tabs>
+        <w:ind w:left="360"/>
+        <w:rPr>
+          <w:b/>
+          <w:bCs/>
+          <w:sz w:val="32"/>
+          <w:szCs w:val="32"/>
+        </w:rPr>
+      </w:pPr>
+    </w:p>
+    <w:p>
+      <w:pPr>
+        <w:pStyle w:val="ListParagraph"/>
+        <w:numPr>
+          <w:ilvl w:val="0"/>
+          <w:numId w:val="8"/>
+        </w:numPr>
+        <w:tabs>
+          <w:tab w:val="left" w:pos="990"/>
+        </w:tabs>
+        <w:rPr>
+          <w:b/>
+          <w:bCs/>
+          <w:sz w:val="32"/>
+          <w:szCs w:val="32"/>
+        </w:rPr>
+      </w:pPr>
+      <w:r>
+        <w:rPr>
+          <w:sz w:val="32"/>
+          <w:szCs w:val="32"/>
+        </w:rPr>
+        <w:t>API for getting list of all users</w:t>
+      </w:r>
+    </w:p>
+    <w:p>
+      <w:pPr>
+        <w:pStyle w:val="ListParagraph"/>
+        <w:numPr>
+          <w:ilvl w:val="0"/>
+          <w:numId w:val="8"/>
+        </w:numPr>
+        <w:tabs>
+          <w:tab w:val="left" w:pos="990"/>
+        </w:tabs>
+        <w:rPr>
+          <w:b/>
+          <w:bCs/>
+          <w:sz w:val="32"/>
+          <w:szCs w:val="32"/>
+        </w:rPr>
+      </w:pPr>
+      <w:r>
+        <w:rPr>
+          <w:sz w:val="32"/>
+          <w:szCs w:val="32"/>
+        </w:rPr>
+        <w:t>API for getting the user based on User ID</w:t>
+      </w:r>
+    </w:p>
+    <w:p>
+      <w:pPr>
+        <w:pStyle w:val="ListParagraph"/>
+        <w:numPr>
+          <w:ilvl w:val="0"/>
+          <w:numId w:val="8"/>
+        </w:numPr>
+        <w:tabs>
+          <w:tab w:val="left" w:pos="990"/>
+        </w:tabs>
+        <w:rPr>
+          <w:b/>
+          <w:bCs/>
+          <w:sz w:val="32"/>
+          <w:szCs w:val="32"/>
+        </w:rPr>
+      </w:pPr>
+      <w:r>
+        <w:rPr>
+          <w:sz w:val="32"/>
+          <w:szCs w:val="32"/>
+        </w:rPr>
+        <w:t>API for updating the user type and status</w:t>
+      </w:r>
+    </w:p>
+    <w:p>
+      <w:pPr>
+        <w:pStyle w:val="ListParagraph"/>
+        <w:numPr>
+          <w:ilvl w:val="0"/>
+          <w:numId w:val="8"/>
+        </w:numPr>
+        <w:tabs>
+          <w:tab w:val="left" w:pos="990"/>
+        </w:tabs>
+        <w:rPr>
+          <w:b/>
+          <w:bCs/>
+          <w:sz w:val="32"/>
+          <w:szCs w:val="32"/>
+        </w:rPr>
+      </w:pPr>
+      <w:r>
+        <w:rPr>
+          <w:sz w:val="32"/>
+          <w:szCs w:val="32"/>
+        </w:rPr>
+        <w:t xml:space="preserve">Authenticating and Authorizing above APIs, so that only authenticated </w:t>
+      </w:r>
+      <w:r>
+        <w:rPr>
+          <w:b/>
+          <w:bCs/>
+          <w:sz w:val="32"/>
+          <w:szCs w:val="32"/>
+        </w:rPr>
+        <w:t>ADMIN</w:t>
+      </w:r>
+      <w:r>
+        <w:rPr>
+          <w:sz w:val="32"/>
+          <w:szCs w:val="32"/>
+        </w:rPr>
+        <w:t xml:space="preserve"> will be allowed to perform above operations.</w:t>
+      </w:r>
+    </w:p>
+    <w:p>
+      <w:pPr>
+        <w:pStyle w:val="ListParagraph"/>
+        <w:numPr>
+          <w:ilvl w:val="0"/>
+          <w:numId w:val="8"/>
+        </w:numPr>
+        <w:tabs>
+          <w:tab w:val="left" w:pos="990"/>
+        </w:tabs>
+        <w:rPr>
+          <w:b/>
+          <w:bCs/>
+          <w:sz w:val="32"/>
+          <w:szCs w:val="32"/>
+        </w:rPr>
+      </w:pPr>
+      <w:r>
+        <w:rPr>
+          <w:b/>
+          <w:bCs/>
+          <w:sz w:val="32"/>
+          <w:szCs w:val="32"/>
+        </w:rPr>
+        <w:t>ENGINEER/ADMIN</w:t>
+      </w:r>
+      <w:r>
+        <w:rPr>
+          <w:sz w:val="32"/>
+          <w:szCs w:val="32"/>
+        </w:rPr>
+        <w:t xml:space="preserve"> should be able to login successfully after the approval from the existing </w:t>
+      </w:r>
+      <w:r>
+        <w:rPr>
+          <w:b/>
+          <w:bCs/>
+          <w:sz w:val="32"/>
+          <w:szCs w:val="32"/>
+        </w:rPr>
+        <w:t>ADMIN</w:t>
+      </w:r>
+      <w:r>
+        <w:rPr>
+          <w:sz w:val="32"/>
+          <w:szCs w:val="32"/>
+        </w:rPr>
+        <w:t>.</w:t>
       </w:r>
     </w:p>
     <w:p>
@@ -1480,6 +1695,119 @@
     </w:lvl>
   </w:abstractNum>
   <w:abstractNum w:abstractNumId="5" w15:restartNumberingAfterBreak="0">
+    <w:nsid w:val="41AE6A4A"/>
+    <w:multiLevelType w:val="hybridMultilevel"/>
+    <w:tmpl w:val="B0F0616E"/>
+    <w:lvl w:ilvl="0" w:tplc="40090001">
+      <w:start w:val="1"/>
+      <w:numFmt w:val="bullet"/>
+      <w:lvlText w:val=""/>
+      <w:lvlJc w:val="left"/>
+      <w:pPr>
+        <w:ind w:left="720" w:hanging="360"/>
+      </w:pPr>
+      <w:rPr>
+        <w:rFonts w:ascii="Symbol" w:hAnsi="Symbol" w:hint="default"/>
+      </w:rPr>
+    </w:lvl>
+    <w:lvl w:ilvl="1" w:tplc="40090003" w:tentative="1">
+      <w:start w:val="1"/>
+      <w:numFmt w:val="bullet"/>
+      <w:lvlText w:val="o"/>
+      <w:lvlJc w:val="left"/>
+      <w:pPr>
+        <w:ind w:left="1440" w:hanging="360"/>
+      </w:pPr>
+      <w:rPr>
+        <w:rFonts w:ascii="Courier New" w:hAnsi="Courier New" w:cs="Courier New" w:hint="default"/>
+      </w:rPr>
+    </w:lvl>
+    <w:lvl w:ilvl="2" w:tplc="40090005" w:tentative="1">
+      <w:start w:val="1"/>
+      <w:numFmt w:val="bullet"/>
+      <w:lvlText w:val=""/>
+      <w:lvlJc w:val="left"/>
+      <w:pPr>
+        <w:ind w:left="2160" w:hanging="360"/>
+      </w:pPr>
+      <w:rPr>
+        <w:rFonts w:ascii="Wingdings" w:hAnsi="Wingdings" w:hint="default"/>
+      </w:rPr>
+    </w:lvl>
+    <w:lvl w:ilvl="3" w:tplc="40090001" w:tentative="1">
+      <w:start w:val="1"/>
+      <w:numFmt w:val="bullet"/>
+      <w:lvlText w:val=""/>
+      <w:lvlJc w:val="left"/>
+      <w:pPr>
+        <w:ind w:left="2880" w:hanging="360"/>
+      </w:pPr>
+      <w:rPr>
+        <w:rFonts w:ascii="Symbol" w:hAnsi="Symbol" w:hint="default"/>
+      </w:rPr>
+    </w:lvl>
+    <w:lvl w:ilvl="4" w:tplc="40090003" w:tentative="1">
+      <w:start w:val="1"/>
+      <w:numFmt w:val="bullet"/>
+      <w:lvlText w:val="o"/>
+      <w:lvlJc w:val="left"/>
+      <w:pPr>
+        <w:ind w:left="3600" w:hanging="360"/>
+      </w:pPr>
+      <w:rPr>
+        <w:rFonts w:ascii="Courier New" w:hAnsi="Courier New" w:cs="Courier New" w:hint="default"/>
+      </w:rPr>
+    </w:lvl>
+    <w:lvl w:ilvl="5" w:tplc="40090005" w:tentative="1">
+      <w:start w:val="1"/>
+      <w:numFmt w:val="bullet"/>
+      <w:lvlText w:val=""/>
+      <w:lvlJc w:val="left"/>
+      <w:pPr>
+        <w:ind w:left="4320" w:hanging="360"/>
+      </w:pPr>
+      <w:rPr>
+        <w:rFonts w:ascii="Wingdings" w:hAnsi="Wingdings" w:hint="default"/>
+      </w:rPr>
+    </w:lvl>
+    <w:lvl w:ilvl="6" w:tplc="40090001" w:tentative="1">
+      <w:start w:val="1"/>
+      <w:numFmt w:val="bullet"/>
+      <w:lvlText w:val=""/>
+      <w:lvlJc w:val="left"/>
+      <w:pPr>
+        <w:ind w:left="5040" w:hanging="360"/>
+      </w:pPr>
+      <w:rPr>
+        <w:rFonts w:ascii="Symbol" w:hAnsi="Symbol" w:hint="default"/>
+      </w:rPr>
+    </w:lvl>
+    <w:lvl w:ilvl="7" w:tplc="40090003" w:tentative="1">
+      <w:start w:val="1"/>
+      <w:numFmt w:val="bullet"/>
+      <w:lvlText w:val="o"/>
+      <w:lvlJc w:val="left"/>
+      <w:pPr>
+        <w:ind w:left="5760" w:hanging="360"/>
+      </w:pPr>
+      <w:rPr>
+        <w:rFonts w:ascii="Courier New" w:hAnsi="Courier New" w:cs="Courier New" w:hint="default"/>
+      </w:rPr>
+    </w:lvl>
+    <w:lvl w:ilvl="8" w:tplc="40090005" w:tentative="1">
+      <w:start w:val="1"/>
+      <w:numFmt w:val="bullet"/>
+      <w:lvlText w:val=""/>
+      <w:lvlJc w:val="left"/>
+      <w:pPr>
+        <w:ind w:left="6480" w:hanging="360"/>
+      </w:pPr>
+      <w:rPr>
+        <w:rFonts w:ascii="Wingdings" w:hAnsi="Wingdings" w:hint="default"/>
+      </w:rPr>
+    </w:lvl>
+  </w:abstractNum>
+  <w:abstractNum w:abstractNumId="6" w15:restartNumberingAfterBreak="0">
     <w:nsid w:val="5B6A374B"/>
     <w:multiLevelType w:val="hybridMultilevel"/>
     <w:tmpl w:val="A0242C5E"/>
@@ -1566,6 +1894,119 @@
       <w:pPr>
         <w:ind w:left="6480" w:hanging="180"/>
       </w:pPr>
+    </w:lvl>
+  </w:abstractNum>
+  <w:abstractNum w:abstractNumId="7" w15:restartNumberingAfterBreak="0">
+    <w:nsid w:val="76CA6A39"/>
+    <w:multiLevelType w:val="hybridMultilevel"/>
+    <w:tmpl w:val="BB624070"/>
+    <w:lvl w:ilvl="0" w:tplc="40090001">
+      <w:start w:val="1"/>
+      <w:numFmt w:val="bullet"/>
+      <w:lvlText w:val=""/>
+      <w:lvlJc w:val="left"/>
+      <w:pPr>
+        <w:ind w:left="1710" w:hanging="360"/>
+      </w:pPr>
+      <w:rPr>
+        <w:rFonts w:ascii="Symbol" w:hAnsi="Symbol" w:hint="default"/>
+      </w:rPr>
+    </w:lvl>
+    <w:lvl w:ilvl="1" w:tplc="40090003" w:tentative="1">
+      <w:start w:val="1"/>
+      <w:numFmt w:val="bullet"/>
+      <w:lvlText w:val="o"/>
+      <w:lvlJc w:val="left"/>
+      <w:pPr>
+        <w:ind w:left="2430" w:hanging="360"/>
+      </w:pPr>
+      <w:rPr>
+        <w:rFonts w:ascii="Courier New" w:hAnsi="Courier New" w:cs="Courier New" w:hint="default"/>
+      </w:rPr>
+    </w:lvl>
+    <w:lvl w:ilvl="2" w:tplc="40090005" w:tentative="1">
+      <w:start w:val="1"/>
+      <w:numFmt w:val="bullet"/>
+      <w:lvlText w:val=""/>
+      <w:lvlJc w:val="left"/>
+      <w:pPr>
+        <w:ind w:left="3150" w:hanging="360"/>
+      </w:pPr>
+      <w:rPr>
+        <w:rFonts w:ascii="Wingdings" w:hAnsi="Wingdings" w:hint="default"/>
+      </w:rPr>
+    </w:lvl>
+    <w:lvl w:ilvl="3" w:tplc="40090001" w:tentative="1">
+      <w:start w:val="1"/>
+      <w:numFmt w:val="bullet"/>
+      <w:lvlText w:val=""/>
+      <w:lvlJc w:val="left"/>
+      <w:pPr>
+        <w:ind w:left="3870" w:hanging="360"/>
+      </w:pPr>
+      <w:rPr>
+        <w:rFonts w:ascii="Symbol" w:hAnsi="Symbol" w:hint="default"/>
+      </w:rPr>
+    </w:lvl>
+    <w:lvl w:ilvl="4" w:tplc="40090003" w:tentative="1">
+      <w:start w:val="1"/>
+      <w:numFmt w:val="bullet"/>
+      <w:lvlText w:val="o"/>
+      <w:lvlJc w:val="left"/>
+      <w:pPr>
+        <w:ind w:left="4590" w:hanging="360"/>
+      </w:pPr>
+      <w:rPr>
+        <w:rFonts w:ascii="Courier New" w:hAnsi="Courier New" w:cs="Courier New" w:hint="default"/>
+      </w:rPr>
+    </w:lvl>
+    <w:lvl w:ilvl="5" w:tplc="40090005" w:tentative="1">
+      <w:start w:val="1"/>
+      <w:numFmt w:val="bullet"/>
+      <w:lvlText w:val=""/>
+      <w:lvlJc w:val="left"/>
+      <w:pPr>
+        <w:ind w:left="5310" w:hanging="360"/>
+      </w:pPr>
+      <w:rPr>
+        <w:rFonts w:ascii="Wingdings" w:hAnsi="Wingdings" w:hint="default"/>
+      </w:rPr>
+    </w:lvl>
+    <w:lvl w:ilvl="6" w:tplc="40090001" w:tentative="1">
+      <w:start w:val="1"/>
+      <w:numFmt w:val="bullet"/>
+      <w:lvlText w:val=""/>
+      <w:lvlJc w:val="left"/>
+      <w:pPr>
+        <w:ind w:left="6030" w:hanging="360"/>
+      </w:pPr>
+      <w:rPr>
+        <w:rFonts w:ascii="Symbol" w:hAnsi="Symbol" w:hint="default"/>
+      </w:rPr>
+    </w:lvl>
+    <w:lvl w:ilvl="7" w:tplc="40090003" w:tentative="1">
+      <w:start w:val="1"/>
+      <w:numFmt w:val="bullet"/>
+      <w:lvlText w:val="o"/>
+      <w:lvlJc w:val="left"/>
+      <w:pPr>
+        <w:ind w:left="6750" w:hanging="360"/>
+      </w:pPr>
+      <w:rPr>
+        <w:rFonts w:ascii="Courier New" w:hAnsi="Courier New" w:cs="Courier New" w:hint="default"/>
+      </w:rPr>
+    </w:lvl>
+    <w:lvl w:ilvl="8" w:tplc="40090005" w:tentative="1">
+      <w:start w:val="1"/>
+      <w:numFmt w:val="bullet"/>
+      <w:lvlText w:val=""/>
+      <w:lvlJc w:val="left"/>
+      <w:pPr>
+        <w:ind w:left="7470" w:hanging="360"/>
+      </w:pPr>
+      <w:rPr>
+        <w:rFonts w:ascii="Wingdings" w:hAnsi="Wingdings" w:hint="default"/>
+      </w:rPr>
     </w:lvl>
   </w:abstractNum>
   <w:num w:numId="1" w16cid:durableId="915210744">
@@ -1581,10 +2022,16 @@
     <w:abstractNumId w:val="2"/>
   </w:num>
   <w:num w:numId="5" w16cid:durableId="463626094">
-    <w:abstractNumId w:val="5"/>
+    <w:abstractNumId w:val="6"/>
   </w:num>
   <w:num w:numId="6" w16cid:durableId="321205528">
     <w:abstractNumId w:val="0"/>
+  </w:num>
+  <w:num w:numId="7" w16cid:durableId="484052675">
+    <w:abstractNumId w:val="7"/>
+  </w:num>
+  <w:num w:numId="8" w16cid:durableId="2134011886">
+    <w:abstractNumId w:val="5"/>
   </w:num>
 </w:numbering>
 </file>

</xml_diff>

<commit_message>
Created logic and routes for getAllTickets and getTicketBasedonId
</commit_message>
<xml_diff>
--- a/CRM App/PRD.docx
+++ b/CRM App/PRD.docx
@@ -970,6 +970,243 @@
           <w:szCs w:val="32"/>
         </w:rPr>
         <w:lastRenderedPageBreak/>
+        <w:t xml:space="preserve">Feature 2: </w:t>
+      </w:r>
+      <w:r>
+        <w:rPr>
+          <w:b/>
+          <w:bCs/>
+          <w:sz w:val="32"/>
+          <w:szCs w:val="32"/>
+        </w:rPr>
+        <w:t>Authenticating and Authorizing the user APIs</w:t>
+      </w:r>
+    </w:p>
+    <w:p>
+      <w:pPr>
+        <w:tabs>
+          <w:tab w:val="left" w:pos="990"/>
+        </w:tabs>
+        <w:ind w:left="360"/>
+        <w:rPr>
+          <w:b/>
+          <w:bCs/>
+          <w:sz w:val="32"/>
+          <w:szCs w:val="32"/>
+        </w:rPr>
+      </w:pPr>
+    </w:p>
+    <w:p>
+      <w:pPr>
+        <w:pStyle w:val="ListParagraph"/>
+        <w:numPr>
+          <w:ilvl w:val="0"/>
+          <w:numId w:val="8"/>
+        </w:numPr>
+        <w:tabs>
+          <w:tab w:val="left" w:pos="990"/>
+        </w:tabs>
+        <w:rPr>
+          <w:b/>
+          <w:bCs/>
+          <w:sz w:val="32"/>
+          <w:szCs w:val="32"/>
+        </w:rPr>
+      </w:pPr>
+      <w:r>
+        <w:rPr>
+          <w:sz w:val="32"/>
+          <w:szCs w:val="32"/>
+        </w:rPr>
+        <w:t>API for getting list of all users</w:t>
+      </w:r>
+    </w:p>
+    <w:p>
+      <w:pPr>
+        <w:pStyle w:val="ListParagraph"/>
+        <w:numPr>
+          <w:ilvl w:val="0"/>
+          <w:numId w:val="8"/>
+        </w:numPr>
+        <w:tabs>
+          <w:tab w:val="left" w:pos="990"/>
+        </w:tabs>
+        <w:rPr>
+          <w:b/>
+          <w:bCs/>
+          <w:sz w:val="32"/>
+          <w:szCs w:val="32"/>
+        </w:rPr>
+      </w:pPr>
+      <w:r>
+        <w:rPr>
+          <w:sz w:val="32"/>
+          <w:szCs w:val="32"/>
+        </w:rPr>
+        <w:t>API for getting the user based on User ID</w:t>
+      </w:r>
+    </w:p>
+    <w:p>
+      <w:pPr>
+        <w:pStyle w:val="ListParagraph"/>
+        <w:numPr>
+          <w:ilvl w:val="0"/>
+          <w:numId w:val="8"/>
+        </w:numPr>
+        <w:tabs>
+          <w:tab w:val="left" w:pos="990"/>
+        </w:tabs>
+        <w:rPr>
+          <w:b/>
+          <w:bCs/>
+          <w:sz w:val="32"/>
+          <w:szCs w:val="32"/>
+        </w:rPr>
+      </w:pPr>
+      <w:r>
+        <w:rPr>
+          <w:sz w:val="32"/>
+          <w:szCs w:val="32"/>
+        </w:rPr>
+        <w:t>API for updating the user type and status</w:t>
+      </w:r>
+    </w:p>
+    <w:p>
+      <w:pPr>
+        <w:pStyle w:val="ListParagraph"/>
+        <w:numPr>
+          <w:ilvl w:val="0"/>
+          <w:numId w:val="8"/>
+        </w:numPr>
+        <w:tabs>
+          <w:tab w:val="left" w:pos="990"/>
+        </w:tabs>
+        <w:rPr>
+          <w:b/>
+          <w:bCs/>
+          <w:sz w:val="32"/>
+          <w:szCs w:val="32"/>
+        </w:rPr>
+      </w:pPr>
+      <w:r>
+        <w:rPr>
+          <w:sz w:val="32"/>
+          <w:szCs w:val="32"/>
+        </w:rPr>
+        <w:t xml:space="preserve">Authenticating and Authorizing above APIs, so that only authenticated </w:t>
+      </w:r>
+      <w:r>
+        <w:rPr>
+          <w:b/>
+          <w:bCs/>
+          <w:sz w:val="32"/>
+          <w:szCs w:val="32"/>
+        </w:rPr>
+        <w:t>ADMIN</w:t>
+      </w:r>
+      <w:r>
+        <w:rPr>
+          <w:sz w:val="32"/>
+          <w:szCs w:val="32"/>
+        </w:rPr>
+        <w:t xml:space="preserve"> will be allowed to perform above operations.</w:t>
+      </w:r>
+    </w:p>
+    <w:p>
+      <w:pPr>
+        <w:pStyle w:val="ListParagraph"/>
+        <w:numPr>
+          <w:ilvl w:val="0"/>
+          <w:numId w:val="8"/>
+        </w:numPr>
+        <w:tabs>
+          <w:tab w:val="left" w:pos="990"/>
+        </w:tabs>
+        <w:rPr>
+          <w:b/>
+          <w:bCs/>
+          <w:sz w:val="32"/>
+          <w:szCs w:val="32"/>
+        </w:rPr>
+      </w:pPr>
+      <w:r>
+        <w:rPr>
+          <w:b/>
+          <w:bCs/>
+          <w:sz w:val="32"/>
+          <w:szCs w:val="32"/>
+        </w:rPr>
+        <w:t>ENGINEER/ADMIN</w:t>
+      </w:r>
+      <w:r>
+        <w:rPr>
+          <w:sz w:val="32"/>
+          <w:szCs w:val="32"/>
+        </w:rPr>
+        <w:t xml:space="preserve"> should be able to login successfully after the approval from the existing </w:t>
+      </w:r>
+      <w:r>
+        <w:rPr>
+          <w:b/>
+          <w:bCs/>
+          <w:sz w:val="32"/>
+          <w:szCs w:val="32"/>
+        </w:rPr>
+        <w:t>ADMIN</w:t>
+      </w:r>
+      <w:r>
+        <w:rPr>
+          <w:sz w:val="32"/>
+          <w:szCs w:val="32"/>
+        </w:rPr>
+        <w:t>.</w:t>
+      </w:r>
+    </w:p>
+    <w:p>
+      <w:pPr>
+        <w:tabs>
+          <w:tab w:val="left" w:pos="990"/>
+        </w:tabs>
+        <w:rPr>
+          <w:sz w:val="28"/>
+          <w:szCs w:val="28"/>
+        </w:rPr>
+      </w:pPr>
+    </w:p>
+    <w:p>
+      <w:pPr>
+        <w:pStyle w:val="ListParagraph"/>
+        <w:tabs>
+          <w:tab w:val="left" w:pos="990"/>
+        </w:tabs>
+        <w:rPr>
+          <w:b/>
+          <w:bCs/>
+          <w:sz w:val="32"/>
+          <w:szCs w:val="32"/>
+        </w:rPr>
+      </w:pPr>
+    </w:p>
+    <w:p>
+      <w:pPr>
+        <w:tabs>
+          <w:tab w:val="left" w:pos="990"/>
+        </w:tabs>
+        <w:ind w:left="360"/>
+        <w:rPr>
+          <w:b/>
+          <w:bCs/>
+          <w:sz w:val="32"/>
+          <w:szCs w:val="32"/>
+        </w:rPr>
+      </w:pPr>
+      <w:r>
+        <w:rPr>
+          <w:b/>
+          <w:bCs/>
+          <w:sz w:val="32"/>
+          <w:szCs w:val="32"/>
+        </w:rPr>
         <w:t xml:space="preserve">Feature </w:t>
       </w:r>
       <w:r>
@@ -979,7 +1216,7 @@
           <w:sz w:val="32"/>
           <w:szCs w:val="32"/>
         </w:rPr>
-        <w:t>2</w:t>
+        <w:t>3</w:t>
       </w:r>
       <w:r>
         <w:rPr>
@@ -997,7 +1234,7 @@
           <w:sz w:val="32"/>
           <w:szCs w:val="32"/>
         </w:rPr>
-        <w:t>Authenticating and Authorizing the user APIs</w:t>
+        <w:t>Ticket Creation</w:t>
       </w:r>
     </w:p>
     <w:p>
@@ -1019,195 +1256,128 @@
         <w:pStyle w:val="ListParagraph"/>
         <w:numPr>
           <w:ilvl w:val="0"/>
-          <w:numId w:val="8"/>
-        </w:numPr>
-        <w:tabs>
-          <w:tab w:val="left" w:pos="990"/>
-        </w:tabs>
-        <w:rPr>
-          <w:b/>
-          <w:bCs/>
-          <w:sz w:val="32"/>
-          <w:szCs w:val="32"/>
-        </w:rPr>
-      </w:pPr>
-      <w:r>
-        <w:rPr>
-          <w:sz w:val="32"/>
-          <w:szCs w:val="32"/>
-        </w:rPr>
-        <w:t>API for getting list of all users</w:t>
-      </w:r>
-    </w:p>
-    <w:p>
-      <w:pPr>
-        <w:pStyle w:val="ListParagraph"/>
-        <w:numPr>
-          <w:ilvl w:val="0"/>
-          <w:numId w:val="8"/>
-        </w:numPr>
-        <w:tabs>
-          <w:tab w:val="left" w:pos="990"/>
-        </w:tabs>
-        <w:rPr>
-          <w:b/>
-          <w:bCs/>
-          <w:sz w:val="32"/>
-          <w:szCs w:val="32"/>
-        </w:rPr>
-      </w:pPr>
-      <w:r>
-        <w:rPr>
-          <w:sz w:val="32"/>
-          <w:szCs w:val="32"/>
-        </w:rPr>
-        <w:t>API for getting the user based on User ID</w:t>
-      </w:r>
-    </w:p>
-    <w:p>
-      <w:pPr>
-        <w:pStyle w:val="ListParagraph"/>
-        <w:numPr>
-          <w:ilvl w:val="0"/>
-          <w:numId w:val="8"/>
-        </w:numPr>
-        <w:tabs>
-          <w:tab w:val="left" w:pos="990"/>
-        </w:tabs>
-        <w:rPr>
-          <w:b/>
-          <w:bCs/>
-          <w:sz w:val="32"/>
-          <w:szCs w:val="32"/>
-        </w:rPr>
-      </w:pPr>
-      <w:r>
-        <w:rPr>
-          <w:sz w:val="32"/>
-          <w:szCs w:val="32"/>
-        </w:rPr>
-        <w:t>API for updating the user type and status</w:t>
-      </w:r>
-    </w:p>
-    <w:p>
-      <w:pPr>
-        <w:pStyle w:val="ListParagraph"/>
-        <w:numPr>
-          <w:ilvl w:val="0"/>
-          <w:numId w:val="8"/>
-        </w:numPr>
-        <w:tabs>
-          <w:tab w:val="left" w:pos="990"/>
-        </w:tabs>
-        <w:rPr>
-          <w:b/>
-          <w:bCs/>
-          <w:sz w:val="32"/>
-          <w:szCs w:val="32"/>
-        </w:rPr>
-      </w:pPr>
-      <w:r>
-        <w:rPr>
-          <w:sz w:val="32"/>
-          <w:szCs w:val="32"/>
-        </w:rPr>
-        <w:t xml:space="preserve">Authenticating and Authorizing above APIs, so that only authenticated </w:t>
-      </w:r>
-      <w:r>
-        <w:rPr>
-          <w:b/>
-          <w:bCs/>
-          <w:sz w:val="32"/>
-          <w:szCs w:val="32"/>
-        </w:rPr>
-        <w:t>ADMIN</w:t>
-      </w:r>
-      <w:r>
-        <w:rPr>
-          <w:sz w:val="32"/>
-          <w:szCs w:val="32"/>
-        </w:rPr>
-        <w:t xml:space="preserve"> will be allowed to perform above operations.</w:t>
-      </w:r>
-    </w:p>
-    <w:p>
-      <w:pPr>
-        <w:pStyle w:val="ListParagraph"/>
-        <w:numPr>
-          <w:ilvl w:val="0"/>
-          <w:numId w:val="8"/>
-        </w:numPr>
-        <w:tabs>
-          <w:tab w:val="left" w:pos="990"/>
-        </w:tabs>
-        <w:rPr>
-          <w:b/>
-          <w:bCs/>
-          <w:sz w:val="32"/>
-          <w:szCs w:val="32"/>
-        </w:rPr>
-      </w:pPr>
-      <w:r>
-        <w:rPr>
-          <w:b/>
-          <w:bCs/>
-          <w:sz w:val="32"/>
-          <w:szCs w:val="32"/>
-        </w:rPr>
-        <w:t>ENGINEER/ADMIN</w:t>
-      </w:r>
-      <w:r>
-        <w:rPr>
-          <w:sz w:val="32"/>
-          <w:szCs w:val="32"/>
-        </w:rPr>
-        <w:t xml:space="preserve"> should be able to login successfully after the approval from the existing </w:t>
-      </w:r>
-      <w:r>
-        <w:rPr>
-          <w:b/>
-          <w:bCs/>
-          <w:sz w:val="32"/>
-          <w:szCs w:val="32"/>
-        </w:rPr>
-        <w:t>ADMIN</w:t>
-      </w:r>
-      <w:r>
-        <w:rPr>
-          <w:sz w:val="32"/>
-          <w:szCs w:val="32"/>
-        </w:rPr>
-        <w:t>.</w:t>
-      </w:r>
-    </w:p>
-    <w:p>
-      <w:pPr>
-        <w:tabs>
-          <w:tab w:val="left" w:pos="990"/>
-        </w:tabs>
-        <w:rPr>
-          <w:sz w:val="28"/>
-          <w:szCs w:val="28"/>
-        </w:rPr>
-      </w:pPr>
-    </w:p>
-    <w:p>
-      <w:pPr>
-        <w:pStyle w:val="ListParagraph"/>
-        <w:tabs>
-          <w:tab w:val="left" w:pos="990"/>
-        </w:tabs>
-        <w:rPr>
-          <w:b/>
-          <w:bCs/>
-          <w:sz w:val="32"/>
-          <w:szCs w:val="32"/>
-        </w:rPr>
-      </w:pPr>
-    </w:p>
-    <w:p>
-      <w:pPr>
-        <w:pStyle w:val="ListParagraph"/>
+          <w:numId w:val="10"/>
+        </w:numPr>
+        <w:tabs>
+          <w:tab w:val="left" w:pos="990"/>
+        </w:tabs>
+        <w:rPr>
+          <w:b/>
+          <w:bCs/>
+          <w:sz w:val="32"/>
+          <w:szCs w:val="32"/>
+        </w:rPr>
+      </w:pPr>
+      <w:r>
+        <w:rPr>
+          <w:sz w:val="32"/>
+          <w:szCs w:val="32"/>
+        </w:rPr>
+        <w:t>API for an authenticated user to raise a request.</w:t>
+      </w:r>
+    </w:p>
+    <w:p>
+      <w:pPr>
+        <w:pStyle w:val="ListParagraph"/>
+        <w:numPr>
+          <w:ilvl w:val="0"/>
+          <w:numId w:val="10"/>
+        </w:numPr>
+        <w:tabs>
+          <w:tab w:val="left" w:pos="990"/>
+        </w:tabs>
+        <w:rPr>
+          <w:b/>
+          <w:bCs/>
+          <w:sz w:val="32"/>
+          <w:szCs w:val="32"/>
+        </w:rPr>
+      </w:pPr>
+      <w:r>
+        <w:rPr>
+          <w:sz w:val="32"/>
+          <w:szCs w:val="32"/>
+        </w:rPr>
+        <w:t>API for an authenticated user to update an existing request</w:t>
+      </w:r>
+    </w:p>
+    <w:p>
+      <w:pPr>
+        <w:pStyle w:val="ListParagraph"/>
+        <w:numPr>
+          <w:ilvl w:val="0"/>
+          <w:numId w:val="10"/>
+        </w:numPr>
+        <w:tabs>
+          <w:tab w:val="left" w:pos="990"/>
+        </w:tabs>
+        <w:rPr>
+          <w:b/>
+          <w:bCs/>
+          <w:sz w:val="32"/>
+          <w:szCs w:val="32"/>
+        </w:rPr>
+      </w:pPr>
+      <w:r>
+        <w:rPr>
+          <w:sz w:val="32"/>
+          <w:szCs w:val="32"/>
+        </w:rPr>
+        <w:t>API for an authenticated user to check the status of the request.</w:t>
+      </w:r>
+    </w:p>
+    <w:p>
+      <w:pPr>
+        <w:pStyle w:val="ListParagraph"/>
+        <w:numPr>
+          <w:ilvl w:val="0"/>
+          <w:numId w:val="10"/>
+        </w:numPr>
+        <w:tabs>
+          <w:tab w:val="left" w:pos="990"/>
+        </w:tabs>
+        <w:rPr>
+          <w:b/>
+          <w:bCs/>
+          <w:sz w:val="32"/>
+          <w:szCs w:val="32"/>
+        </w:rPr>
+      </w:pPr>
+      <w:r>
+        <w:rPr>
+          <w:sz w:val="32"/>
+          <w:szCs w:val="32"/>
+        </w:rPr>
+        <w:t>API for an authenticated user to check the list of all the requests raised so far.</w:t>
+      </w:r>
+    </w:p>
+    <w:p>
+      <w:pPr>
+        <w:pStyle w:val="ListParagraph"/>
+        <w:numPr>
+          <w:ilvl w:val="0"/>
+          <w:numId w:val="10"/>
+        </w:numPr>
+        <w:tabs>
+          <w:tab w:val="left" w:pos="990"/>
+        </w:tabs>
+        <w:rPr>
+          <w:b/>
+          <w:bCs/>
+          <w:sz w:val="32"/>
+          <w:szCs w:val="32"/>
+        </w:rPr>
+      </w:pPr>
+      <w:r>
+        <w:rPr>
+          <w:sz w:val="32"/>
+          <w:szCs w:val="32"/>
+        </w:rPr>
+        <w:t>Registered Engineer if any should be assigned the ticket automatically.</w:t>
+      </w:r>
+    </w:p>
+    <w:p>
+      <w:pPr>
         <w:tabs>
           <w:tab w:val="left" w:pos="990"/>
         </w:tabs>
@@ -1520,6 +1690,119 @@
     </w:lvl>
   </w:abstractNum>
   <w:abstractNum w:abstractNumId="3" w15:restartNumberingAfterBreak="0">
+    <w:nsid w:val="30E74597"/>
+    <w:multiLevelType w:val="hybridMultilevel"/>
+    <w:tmpl w:val="D29E8AE2"/>
+    <w:lvl w:ilvl="0" w:tplc="40090001">
+      <w:start w:val="1"/>
+      <w:numFmt w:val="bullet"/>
+      <w:lvlText w:val=""/>
+      <w:lvlJc w:val="left"/>
+      <w:pPr>
+        <w:ind w:left="720" w:hanging="360"/>
+      </w:pPr>
+      <w:rPr>
+        <w:rFonts w:ascii="Symbol" w:hAnsi="Symbol" w:hint="default"/>
+      </w:rPr>
+    </w:lvl>
+    <w:lvl w:ilvl="1" w:tplc="40090003">
+      <w:start w:val="1"/>
+      <w:numFmt w:val="bullet"/>
+      <w:lvlText w:val="o"/>
+      <w:lvlJc w:val="left"/>
+      <w:pPr>
+        <w:ind w:left="1440" w:hanging="360"/>
+      </w:pPr>
+      <w:rPr>
+        <w:rFonts w:ascii="Courier New" w:hAnsi="Courier New" w:cs="Courier New" w:hint="default"/>
+      </w:rPr>
+    </w:lvl>
+    <w:lvl w:ilvl="2" w:tplc="40090005" w:tentative="1">
+      <w:start w:val="1"/>
+      <w:numFmt w:val="bullet"/>
+      <w:lvlText w:val=""/>
+      <w:lvlJc w:val="left"/>
+      <w:pPr>
+        <w:ind w:left="2160" w:hanging="360"/>
+      </w:pPr>
+      <w:rPr>
+        <w:rFonts w:ascii="Wingdings" w:hAnsi="Wingdings" w:hint="default"/>
+      </w:rPr>
+    </w:lvl>
+    <w:lvl w:ilvl="3" w:tplc="40090001" w:tentative="1">
+      <w:start w:val="1"/>
+      <w:numFmt w:val="bullet"/>
+      <w:lvlText w:val=""/>
+      <w:lvlJc w:val="left"/>
+      <w:pPr>
+        <w:ind w:left="2880" w:hanging="360"/>
+      </w:pPr>
+      <w:rPr>
+        <w:rFonts w:ascii="Symbol" w:hAnsi="Symbol" w:hint="default"/>
+      </w:rPr>
+    </w:lvl>
+    <w:lvl w:ilvl="4" w:tplc="40090003" w:tentative="1">
+      <w:start w:val="1"/>
+      <w:numFmt w:val="bullet"/>
+      <w:lvlText w:val="o"/>
+      <w:lvlJc w:val="left"/>
+      <w:pPr>
+        <w:ind w:left="3600" w:hanging="360"/>
+      </w:pPr>
+      <w:rPr>
+        <w:rFonts w:ascii="Courier New" w:hAnsi="Courier New" w:cs="Courier New" w:hint="default"/>
+      </w:rPr>
+    </w:lvl>
+    <w:lvl w:ilvl="5" w:tplc="40090005" w:tentative="1">
+      <w:start w:val="1"/>
+      <w:numFmt w:val="bullet"/>
+      <w:lvlText w:val=""/>
+      <w:lvlJc w:val="left"/>
+      <w:pPr>
+        <w:ind w:left="4320" w:hanging="360"/>
+      </w:pPr>
+      <w:rPr>
+        <w:rFonts w:ascii="Wingdings" w:hAnsi="Wingdings" w:hint="default"/>
+      </w:rPr>
+    </w:lvl>
+    <w:lvl w:ilvl="6" w:tplc="40090001" w:tentative="1">
+      <w:start w:val="1"/>
+      <w:numFmt w:val="bullet"/>
+      <w:lvlText w:val=""/>
+      <w:lvlJc w:val="left"/>
+      <w:pPr>
+        <w:ind w:left="5040" w:hanging="360"/>
+      </w:pPr>
+      <w:rPr>
+        <w:rFonts w:ascii="Symbol" w:hAnsi="Symbol" w:hint="default"/>
+      </w:rPr>
+    </w:lvl>
+    <w:lvl w:ilvl="7" w:tplc="40090003" w:tentative="1">
+      <w:start w:val="1"/>
+      <w:numFmt w:val="bullet"/>
+      <w:lvlText w:val="o"/>
+      <w:lvlJc w:val="left"/>
+      <w:pPr>
+        <w:ind w:left="5760" w:hanging="360"/>
+      </w:pPr>
+      <w:rPr>
+        <w:rFonts w:ascii="Courier New" w:hAnsi="Courier New" w:cs="Courier New" w:hint="default"/>
+      </w:rPr>
+    </w:lvl>
+    <w:lvl w:ilvl="8" w:tplc="40090005" w:tentative="1">
+      <w:start w:val="1"/>
+      <w:numFmt w:val="bullet"/>
+      <w:lvlText w:val=""/>
+      <w:lvlJc w:val="left"/>
+      <w:pPr>
+        <w:ind w:left="6480" w:hanging="360"/>
+      </w:pPr>
+      <w:rPr>
+        <w:rFonts w:ascii="Wingdings" w:hAnsi="Wingdings" w:hint="default"/>
+      </w:rPr>
+    </w:lvl>
+  </w:abstractNum>
+  <w:abstractNum w:abstractNumId="4" w15:restartNumberingAfterBreak="0">
     <w:nsid w:val="36C9783E"/>
     <w:multiLevelType w:val="hybridMultilevel"/>
     <w:tmpl w:val="C7769A72"/>
@@ -1608,7 +1891,7 @@
       </w:pPr>
     </w:lvl>
   </w:abstractNum>
-  <w:abstractNum w:abstractNumId="4" w15:restartNumberingAfterBreak="0">
+  <w:abstractNum w:abstractNumId="5" w15:restartNumberingAfterBreak="0">
     <w:nsid w:val="39407E44"/>
     <w:multiLevelType w:val="hybridMultilevel"/>
     <w:tmpl w:val="7562BBCE"/>
@@ -1694,7 +1977,7 @@
       </w:pPr>
     </w:lvl>
   </w:abstractNum>
-  <w:abstractNum w:abstractNumId="5" w15:restartNumberingAfterBreak="0">
+  <w:abstractNum w:abstractNumId="6" w15:restartNumberingAfterBreak="0">
     <w:nsid w:val="41AE6A4A"/>
     <w:multiLevelType w:val="hybridMultilevel"/>
     <w:tmpl w:val="B0F0616E"/>
@@ -1807,7 +2090,120 @@
       </w:rPr>
     </w:lvl>
   </w:abstractNum>
-  <w:abstractNum w:abstractNumId="6" w15:restartNumberingAfterBreak="0">
+  <w:abstractNum w:abstractNumId="7" w15:restartNumberingAfterBreak="0">
+    <w:nsid w:val="546D1967"/>
+    <w:multiLevelType w:val="hybridMultilevel"/>
+    <w:tmpl w:val="8FAADED6"/>
+    <w:lvl w:ilvl="0" w:tplc="40090001">
+      <w:start w:val="1"/>
+      <w:numFmt w:val="bullet"/>
+      <w:lvlText w:val=""/>
+      <w:lvlJc w:val="left"/>
+      <w:pPr>
+        <w:ind w:left="1080" w:hanging="360"/>
+      </w:pPr>
+      <w:rPr>
+        <w:rFonts w:ascii="Symbol" w:hAnsi="Symbol" w:hint="default"/>
+      </w:rPr>
+    </w:lvl>
+    <w:lvl w:ilvl="1" w:tplc="40090003" w:tentative="1">
+      <w:start w:val="1"/>
+      <w:numFmt w:val="bullet"/>
+      <w:lvlText w:val="o"/>
+      <w:lvlJc w:val="left"/>
+      <w:pPr>
+        <w:ind w:left="1800" w:hanging="360"/>
+      </w:pPr>
+      <w:rPr>
+        <w:rFonts w:ascii="Courier New" w:hAnsi="Courier New" w:cs="Courier New" w:hint="default"/>
+      </w:rPr>
+    </w:lvl>
+    <w:lvl w:ilvl="2" w:tplc="40090005" w:tentative="1">
+      <w:start w:val="1"/>
+      <w:numFmt w:val="bullet"/>
+      <w:lvlText w:val=""/>
+      <w:lvlJc w:val="left"/>
+      <w:pPr>
+        <w:ind w:left="2520" w:hanging="360"/>
+      </w:pPr>
+      <w:rPr>
+        <w:rFonts w:ascii="Wingdings" w:hAnsi="Wingdings" w:hint="default"/>
+      </w:rPr>
+    </w:lvl>
+    <w:lvl w:ilvl="3" w:tplc="40090001" w:tentative="1">
+      <w:start w:val="1"/>
+      <w:numFmt w:val="bullet"/>
+      <w:lvlText w:val=""/>
+      <w:lvlJc w:val="left"/>
+      <w:pPr>
+        <w:ind w:left="3240" w:hanging="360"/>
+      </w:pPr>
+      <w:rPr>
+        <w:rFonts w:ascii="Symbol" w:hAnsi="Symbol" w:hint="default"/>
+      </w:rPr>
+    </w:lvl>
+    <w:lvl w:ilvl="4" w:tplc="40090003" w:tentative="1">
+      <w:start w:val="1"/>
+      <w:numFmt w:val="bullet"/>
+      <w:lvlText w:val="o"/>
+      <w:lvlJc w:val="left"/>
+      <w:pPr>
+        <w:ind w:left="3960" w:hanging="360"/>
+      </w:pPr>
+      <w:rPr>
+        <w:rFonts w:ascii="Courier New" w:hAnsi="Courier New" w:cs="Courier New" w:hint="default"/>
+      </w:rPr>
+    </w:lvl>
+    <w:lvl w:ilvl="5" w:tplc="40090005" w:tentative="1">
+      <w:start w:val="1"/>
+      <w:numFmt w:val="bullet"/>
+      <w:lvlText w:val=""/>
+      <w:lvlJc w:val="left"/>
+      <w:pPr>
+        <w:ind w:left="4680" w:hanging="360"/>
+      </w:pPr>
+      <w:rPr>
+        <w:rFonts w:ascii="Wingdings" w:hAnsi="Wingdings" w:hint="default"/>
+      </w:rPr>
+    </w:lvl>
+    <w:lvl w:ilvl="6" w:tplc="40090001" w:tentative="1">
+      <w:start w:val="1"/>
+      <w:numFmt w:val="bullet"/>
+      <w:lvlText w:val=""/>
+      <w:lvlJc w:val="left"/>
+      <w:pPr>
+        <w:ind w:left="5400" w:hanging="360"/>
+      </w:pPr>
+      <w:rPr>
+        <w:rFonts w:ascii="Symbol" w:hAnsi="Symbol" w:hint="default"/>
+      </w:rPr>
+    </w:lvl>
+    <w:lvl w:ilvl="7" w:tplc="40090003" w:tentative="1">
+      <w:start w:val="1"/>
+      <w:numFmt w:val="bullet"/>
+      <w:lvlText w:val="o"/>
+      <w:lvlJc w:val="left"/>
+      <w:pPr>
+        <w:ind w:left="6120" w:hanging="360"/>
+      </w:pPr>
+      <w:rPr>
+        <w:rFonts w:ascii="Courier New" w:hAnsi="Courier New" w:cs="Courier New" w:hint="default"/>
+      </w:rPr>
+    </w:lvl>
+    <w:lvl w:ilvl="8" w:tplc="40090005" w:tentative="1">
+      <w:start w:val="1"/>
+      <w:numFmt w:val="bullet"/>
+      <w:lvlText w:val=""/>
+      <w:lvlJc w:val="left"/>
+      <w:pPr>
+        <w:ind w:left="6840" w:hanging="360"/>
+      </w:pPr>
+      <w:rPr>
+        <w:rFonts w:ascii="Wingdings" w:hAnsi="Wingdings" w:hint="default"/>
+      </w:rPr>
+    </w:lvl>
+  </w:abstractNum>
+  <w:abstractNum w:abstractNumId="8" w15:restartNumberingAfterBreak="0">
     <w:nsid w:val="5B6A374B"/>
     <w:multiLevelType w:val="hybridMultilevel"/>
     <w:tmpl w:val="A0242C5E"/>
@@ -1896,7 +2292,7 @@
       </w:pPr>
     </w:lvl>
   </w:abstractNum>
-  <w:abstractNum w:abstractNumId="7" w15:restartNumberingAfterBreak="0">
+  <w:abstractNum w:abstractNumId="9" w15:restartNumberingAfterBreak="0">
     <w:nsid w:val="76CA6A39"/>
     <w:multiLevelType w:val="hybridMultilevel"/>
     <w:tmpl w:val="BB624070"/>
@@ -2010,28 +2406,34 @@
     </w:lvl>
   </w:abstractNum>
   <w:num w:numId="1" w16cid:durableId="915210744">
-    <w:abstractNumId w:val="4"/>
+    <w:abstractNumId w:val="5"/>
   </w:num>
   <w:num w:numId="2" w16cid:durableId="1923492583">
     <w:abstractNumId w:val="1"/>
   </w:num>
   <w:num w:numId="3" w16cid:durableId="688726894">
-    <w:abstractNumId w:val="3"/>
+    <w:abstractNumId w:val="4"/>
   </w:num>
   <w:num w:numId="4" w16cid:durableId="44917915">
     <w:abstractNumId w:val="2"/>
   </w:num>
   <w:num w:numId="5" w16cid:durableId="463626094">
-    <w:abstractNumId w:val="6"/>
+    <w:abstractNumId w:val="8"/>
   </w:num>
   <w:num w:numId="6" w16cid:durableId="321205528">
     <w:abstractNumId w:val="0"/>
   </w:num>
   <w:num w:numId="7" w16cid:durableId="484052675">
+    <w:abstractNumId w:val="9"/>
+  </w:num>
+  <w:num w:numId="8" w16cid:durableId="2134011886">
+    <w:abstractNumId w:val="6"/>
+  </w:num>
+  <w:num w:numId="9" w16cid:durableId="793595907">
     <w:abstractNumId w:val="7"/>
   </w:num>
-  <w:num w:numId="8" w16cid:durableId="2134011886">
-    <w:abstractNumId w:val="5"/>
+  <w:num w:numId="10" w16cid:durableId="635767469">
+    <w:abstractNumId w:val="3"/>
   </w:num>
 </w:numbering>
 </file>

</xml_diff>